<commit_message>
updated doku to current stand
</commit_message>
<xml_diff>
--- a/Benutzer Dokumentation.docx
+++ b/Benutzer Dokumentation.docx
@@ -54,6 +54,74 @@
       </w:pPr>
       <w:r>
         <w:t>Jannis Brand &amp; Melina Schübbe</w:t>
+      </w:r>
+    </w:p>
+    <w:p>
+      <w:pPr>
+        <w:jc w:val="center"/>
+      </w:pPr>
+    </w:p>
+    <w:p>
+      <w:pPr>
+        <w:jc w:val="center"/>
+      </w:pPr>
+    </w:p>
+    <w:p>
+      <w:pPr>
+        <w:jc w:val="center"/>
+      </w:pPr>
+      <w:r>
+        <w:rPr>
+          <w:noProof/>
+        </w:rPr>
+        <w:drawing>
+          <wp:inline distT="0" distB="0" distL="0" distR="0" wp14:anchorId="0E056480" wp14:editId="76F2158F">
+            <wp:extent cx="5770823" cy="5770823"/>
+            <wp:effectExtent l="0" t="0" r="0" b="0"/>
+            <wp:docPr id="1951979127" name="Grafik 1"/>
+            <wp:cNvGraphicFramePr>
+              <a:graphicFrameLocks xmlns:a="http://schemas.openxmlformats.org/drawingml/2006/main" noChangeAspect="1"/>
+            </wp:cNvGraphicFramePr>
+            <a:graphic xmlns:a="http://schemas.openxmlformats.org/drawingml/2006/main">
+              <a:graphicData uri="http://schemas.openxmlformats.org/drawingml/2006/picture">
+                <pic:pic xmlns:pic="http://schemas.openxmlformats.org/drawingml/2006/picture">
+                  <pic:nvPicPr>
+                    <pic:cNvPr id="0" name="Picture 1"/>
+                    <pic:cNvPicPr>
+                      <a:picLocks noChangeAspect="1" noChangeArrowheads="1"/>
+                    </pic:cNvPicPr>
+                  </pic:nvPicPr>
+                  <pic:blipFill>
+                    <a:blip r:embed="rId6">
+                      <a:extLst>
+                        <a:ext uri="{28A0092B-C50C-407E-A947-70E740481C1C}">
+                          <a14:useLocalDpi xmlns:a14="http://schemas.microsoft.com/office/drawing/2010/main" val="0"/>
+                        </a:ext>
+                      </a:extLst>
+                    </a:blip>
+                    <a:srcRect/>
+                    <a:stretch>
+                      <a:fillRect/>
+                    </a:stretch>
+                  </pic:blipFill>
+                  <pic:spPr bwMode="auto">
+                    <a:xfrm>
+                      <a:off x="0" y="0"/>
+                      <a:ext cx="5800441" cy="5800441"/>
+                    </a:xfrm>
+                    <a:prstGeom prst="rect">
+                      <a:avLst/>
+                    </a:prstGeom>
+                    <a:noFill/>
+                    <a:ln>
+                      <a:noFill/>
+                    </a:ln>
+                  </pic:spPr>
+                </pic:pic>
+              </a:graphicData>
+            </a:graphic>
+          </wp:inline>
+        </w:drawing>
       </w:r>
     </w:p>
     <w:p>
@@ -99,7 +167,61 @@
     </w:p>
     <w:p>
       <w:r>
-        <w:t>Nach auswählen des Endless Modus kann man einen Charakter wählen. Dann lädt man direkt ins erste Level. Auf der linken Seite ist der Spieler und auf der rechten Seite der Gegner. Über diesen sind die Lebensanzeigen. Am unteren Bildschirmrand sind die Karten, die aktuell gespielt werden können. Um die Karten zu spielen, muss man auf eine Karte und dann das Ziel klicken. Nachdem die Karte ausgeführt wurde, soll sie aus der Hand entfernt werden. Das Level ist beendet, wenn der Gegner besiegt ist.</w:t>
+        <w:t xml:space="preserve">Nach auswählen des Endless Modus kann man einen Charakter wählen. Dann lädt man direkt ins erste Level. Auf der linken Seite ist der Spieler und auf der rechten Seite der Gegner. Über diesen sind die Lebensanzeigen. Am unteren Bildschirmrand sind die Karten, die aktuell gespielt werden können. Um die Karten zu spielen, muss man auf eine Karte und dann das Ziel klicken. </w:t>
+      </w:r>
+      <w:r>
+        <w:t xml:space="preserve">Karten die Schaden verursachen wirken auf den Gegner und Block Karten sind für den Spieler. </w:t>
+      </w:r>
+      <w:r>
+        <w:t xml:space="preserve">Nachdem die Karte ausgeführt </w:t>
+      </w:r>
+      <w:r>
+        <w:t>wurde, wird</w:t>
+      </w:r>
+      <w:r>
+        <w:t xml:space="preserve"> sie aus der Hand entfernt werden. Das Level ist beendet, wenn der Gegner besiegt ist.</w:t>
+      </w:r>
+    </w:p>
+    <w:p>
+      <w:r>
+        <w:rPr>
+          <w:noProof/>
+        </w:rPr>
+        <w:drawing>
+          <wp:inline distT="0" distB="0" distL="0" distR="0" wp14:anchorId="44410B08" wp14:editId="7118D34E">
+            <wp:extent cx="5760720" cy="3609340"/>
+            <wp:effectExtent l="0" t="0" r="0" b="0"/>
+            <wp:docPr id="1310613442" name="Grafik 1"/>
+            <wp:cNvGraphicFramePr>
+              <a:graphicFrameLocks xmlns:a="http://schemas.openxmlformats.org/drawingml/2006/main" noChangeAspect="1"/>
+            </wp:cNvGraphicFramePr>
+            <a:graphic xmlns:a="http://schemas.openxmlformats.org/drawingml/2006/main">
+              <a:graphicData uri="http://schemas.openxmlformats.org/drawingml/2006/picture">
+                <pic:pic xmlns:pic="http://schemas.openxmlformats.org/drawingml/2006/picture">
+                  <pic:nvPicPr>
+                    <pic:cNvPr id="1310613442" name=""/>
+                    <pic:cNvPicPr/>
+                  </pic:nvPicPr>
+                  <pic:blipFill>
+                    <a:blip r:embed="rId7"/>
+                    <a:stretch>
+                      <a:fillRect/>
+                    </a:stretch>
+                  </pic:blipFill>
+                  <pic:spPr>
+                    <a:xfrm>
+                      <a:off x="0" y="0"/>
+                      <a:ext cx="5760720" cy="3609340"/>
+                    </a:xfrm>
+                    <a:prstGeom prst="rect">
+                      <a:avLst/>
+                    </a:prstGeom>
+                  </pic:spPr>
+                </pic:pic>
+              </a:graphicData>
+            </a:graphic>
+          </wp:inline>
+        </w:drawing>
       </w:r>
     </w:p>
     <w:p/>
@@ -124,6 +246,7 @@
         <w:pStyle w:val="berschrift3"/>
       </w:pPr>
       <w:r>
+        <w:lastRenderedPageBreak/>
         <w:t>Warrior</w:t>
       </w:r>
     </w:p>
@@ -269,7 +392,6 @@
         <w:pStyle w:val="berschrift3"/>
       </w:pPr>
       <w:r>
-        <w:lastRenderedPageBreak/>
         <w:t>Skill</w:t>
       </w:r>
     </w:p>
@@ -333,16 +455,28 @@
     </w:p>
     <w:p>
       <w:r>
-        <w:t>Die Gegner haben eine bestimmte Menge HP und müssen besiegt werden, um einen Kampf zu gewinnen. Um Strategisch auf die Gegner reagieren zu können zeigen diese ihren nächsten Zug an, also zum Beispiel ob sie einen Angriff machen und wie viel Schaden dieser verursacht.</w:t>
+        <w:t xml:space="preserve">Die Gegner haben eine bestimmte Menge HP und müssen besiegt werden, um einen Kampf zu gewinnen. Um Strategisch auf die Gegner reagieren zu können </w:t>
+      </w:r>
+      <w:r>
+        <w:t>sollen</w:t>
+      </w:r>
+      <w:r>
+        <w:t xml:space="preserve"> diese ihren nächsten Zug </w:t>
+      </w:r>
+      <w:r>
+        <w:t>anzeigen</w:t>
+      </w:r>
+      <w:r>
+        <w:t>, also zum Beispiel ob sie einen Angriff machen und wie viel Schaden dieser verursacht.</w:t>
+      </w:r>
+      <w:r>
+        <w:t xml:space="preserve"> Aktuelle zeigen die Gegner es jedoch nicht an.</w:t>
       </w:r>
     </w:p>
     <w:p>
       <w:r>
         <w:t>Es gibt Normale Gegner und Bosse. Bosse erscheinen alle Zehn Kämpfe und sind schwerer als normale Gegner.</w:t>
       </w:r>
-      <w:r>
-        <w:t xml:space="preserve"> (Bosse sollen noch hinzugefügt werden)</w:t>
-      </w:r>
     </w:p>
     <w:p/>
     <w:p>
@@ -362,6 +496,7 @@
       </w:r>
     </w:p>
     <w:sectPr>
+      <w:footerReference w:type="default" r:id="rId8"/>
       <w:pgSz w:w="11906" w:h="16838"/>
       <w:pgMar w:top="1417" w:right="1417" w:bottom="1134" w:left="1417" w:header="708" w:footer="708" w:gutter="0"/>
       <w:cols w:space="708"/>
@@ -369,6 +504,97 @@
     </w:sectPr>
   </w:body>
 </w:document>
+</file>
+
+<file path=word/endnotes.xml><?xml version="1.0" encoding="utf-8"?>
+<w:endnotes xmlns:wpc="http://schemas.microsoft.com/office/word/2010/wordprocessingCanvas" xmlns:cx="http://schemas.microsoft.com/office/drawing/2014/chartex" xmlns:cx1="http://schemas.microsoft.com/office/drawing/2015/9/8/chartex" xmlns:cx2="http://schemas.microsoft.com/office/drawing/2015/10/21/chartex" xmlns:cx3="http://schemas.microsoft.com/office/drawing/2016/5/9/chartex" xmlns:cx4="http://schemas.microsoft.com/office/drawing/2016/5/10/chartex" xmlns:cx5="http://schemas.microsoft.com/office/drawing/2016/5/11/chartex" xmlns:cx6="http://schemas.microsoft.com/office/drawing/2016/5/12/chartex" xmlns:cx7="http://schemas.microsoft.com/office/drawing/2016/5/13/chartex" xmlns:cx8="http://schemas.microsoft.com/office/drawing/2016/5/14/chartex" xmlns:mc="http://schemas.openxmlformats.org/markup-compatibility/2006" xmlns:aink="http://schemas.microsoft.com/office/drawing/2016/ink" xmlns:am3d="http://schemas.microsoft.com/office/drawing/2017/model3d" xmlns:o="urn:schemas-microsoft-com:office:office" xmlns:oel="http://schemas.microsoft.com/office/2019/extlst" xmlns:r="http://schemas.openxmlformats.org/officeDocument/2006/relationships" xmlns:m="http://schemas.openxmlformats.org/officeDocument/2006/math" xmlns:v="urn:schemas-microsoft-com:vml" xmlns:wp14="http://schemas.microsoft.com/office/word/2010/wordprocessingDrawing" xmlns:wp="http://schemas.openxmlformats.org/drawingml/2006/wordprocessingDrawing" xmlns:w10="urn:schemas-microsoft-com:office:word" xmlns:w="http://schemas.openxmlformats.org/wordprocessingml/2006/main" xmlns:w14="http://schemas.microsoft.com/office/word/2010/wordml" xmlns:w15="http://schemas.microsoft.com/office/word/2012/wordml" xmlns:w16cex="http://schemas.microsoft.com/office/word/2018/wordml/cex" xmlns:w16cid="http://schemas.microsoft.com/office/word/2016/wordml/cid" xmlns:w16="http://schemas.microsoft.com/office/word/2018/wordml" xmlns:w16sdtdh="http://schemas.microsoft.com/office/word/2020/wordml/sdtdatahash" xmlns:w16se="http://schemas.microsoft.com/office/word/2015/wordml/symex" xmlns:wpg="http://schemas.microsoft.com/office/word/2010/wordprocessingGroup" xmlns:wpi="http://schemas.microsoft.com/office/word/2010/wordprocessingInk" xmlns:wne="http://schemas.microsoft.com/office/word/2006/wordml" xmlns:wps="http://schemas.microsoft.com/office/word/2010/wordprocessingShape" mc:Ignorable="w14 w15 w16se w16cid w16 w16cex w16sdtdh wp14">
+  <w:endnote w:type="separator" w:id="-1">
+    <w:p>
+      <w:pPr>
+        <w:spacing w:after="0" w:line="240" w:lineRule="auto"/>
+      </w:pPr>
+      <w:r>
+        <w:separator/>
+      </w:r>
+    </w:p>
+  </w:endnote>
+  <w:endnote w:type="continuationSeparator" w:id="0">
+    <w:p>
+      <w:pPr>
+        <w:spacing w:after="0" w:line="240" w:lineRule="auto"/>
+      </w:pPr>
+      <w:r>
+        <w:continuationSeparator/>
+      </w:r>
+    </w:p>
+  </w:endnote>
+</w:endnotes>
+</file>
+
+<file path=word/footer1.xml><?xml version="1.0" encoding="utf-8"?>
+<w:ftr xmlns:wpc="http://schemas.microsoft.com/office/word/2010/wordprocessingCanvas" xmlns:cx="http://schemas.microsoft.com/office/drawing/2014/chartex" xmlns:cx1="http://schemas.microsoft.com/office/drawing/2015/9/8/chartex" xmlns:cx2="http://schemas.microsoft.com/office/drawing/2015/10/21/chartex" xmlns:cx3="http://schemas.microsoft.com/office/drawing/2016/5/9/chartex" xmlns:cx4="http://schemas.microsoft.com/office/drawing/2016/5/10/chartex" xmlns:cx5="http://schemas.microsoft.com/office/drawing/2016/5/11/chartex" xmlns:cx6="http://schemas.microsoft.com/office/drawing/2016/5/12/chartex" xmlns:cx7="http://schemas.microsoft.com/office/drawing/2016/5/13/chartex" xmlns:cx8="http://schemas.microsoft.com/office/drawing/2016/5/14/chartex" xmlns:mc="http://schemas.openxmlformats.org/markup-compatibility/2006" xmlns:aink="http://schemas.microsoft.com/office/drawing/2016/ink" xmlns:am3d="http://schemas.microsoft.com/office/drawing/2017/model3d" xmlns:o="urn:schemas-microsoft-com:office:office" xmlns:oel="http://schemas.microsoft.com/office/2019/extlst" xmlns:r="http://schemas.openxmlformats.org/officeDocument/2006/relationships" xmlns:m="http://schemas.openxmlformats.org/officeDocument/2006/math" xmlns:v="urn:schemas-microsoft-com:vml" xmlns:wp14="http://schemas.microsoft.com/office/word/2010/wordprocessingDrawing" xmlns:wp="http://schemas.openxmlformats.org/drawingml/2006/wordprocessingDrawing" xmlns:w10="urn:schemas-microsoft-com:office:word" xmlns:w="http://schemas.openxmlformats.org/wordprocessingml/2006/main" xmlns:w14="http://schemas.microsoft.com/office/word/2010/wordml" xmlns:w15="http://schemas.microsoft.com/office/word/2012/wordml" xmlns:w16cex="http://schemas.microsoft.com/office/word/2018/wordml/cex" xmlns:w16cid="http://schemas.microsoft.com/office/word/2016/wordml/cid" xmlns:w16="http://schemas.microsoft.com/office/word/2018/wordml" xmlns:w16sdtdh="http://schemas.microsoft.com/office/word/2020/wordml/sdtdatahash" xmlns:w16se="http://schemas.microsoft.com/office/word/2015/wordml/symex" xmlns:wpg="http://schemas.microsoft.com/office/word/2010/wordprocessingGroup" xmlns:wpi="http://schemas.microsoft.com/office/word/2010/wordprocessingInk" xmlns:wne="http://schemas.microsoft.com/office/word/2006/wordml" xmlns:wps="http://schemas.microsoft.com/office/word/2010/wordprocessingShape" mc:Ignorable="w14 w15 w16se w16cid w16 w16cex w16sdtdh wp14">
+  <w:sdt>
+    <w:sdtPr>
+      <w:id w:val="-412927437"/>
+      <w:docPartObj>
+        <w:docPartGallery w:val="Page Numbers (Bottom of Page)"/>
+        <w:docPartUnique/>
+      </w:docPartObj>
+    </w:sdtPr>
+    <w:sdtContent>
+      <w:p>
+        <w:pPr>
+          <w:pStyle w:val="Fuzeile"/>
+        </w:pPr>
+        <w:r>
+          <w:fldChar w:fldCharType="begin"/>
+        </w:r>
+        <w:r>
+          <w:instrText>PAGE   \* MERGEFORMAT</w:instrText>
+        </w:r>
+        <w:r>
+          <w:fldChar w:fldCharType="separate"/>
+        </w:r>
+        <w:r>
+          <w:t>2</w:t>
+        </w:r>
+        <w:r>
+          <w:fldChar w:fldCharType="end"/>
+        </w:r>
+      </w:p>
+    </w:sdtContent>
+  </w:sdt>
+  <w:p>
+    <w:pPr>
+      <w:pStyle w:val="Fuzeile"/>
+    </w:pPr>
+  </w:p>
+</w:ftr>
+</file>
+
+<file path=word/footnotes.xml><?xml version="1.0" encoding="utf-8"?>
+<w:footnotes xmlns:wpc="http://schemas.microsoft.com/office/word/2010/wordprocessingCanvas" xmlns:cx="http://schemas.microsoft.com/office/drawing/2014/chartex" xmlns:cx1="http://schemas.microsoft.com/office/drawing/2015/9/8/chartex" xmlns:cx2="http://schemas.microsoft.com/office/drawing/2015/10/21/chartex" xmlns:cx3="http://schemas.microsoft.com/office/drawing/2016/5/9/chartex" xmlns:cx4="http://schemas.microsoft.com/office/drawing/2016/5/10/chartex" xmlns:cx5="http://schemas.microsoft.com/office/drawing/2016/5/11/chartex" xmlns:cx6="http://schemas.microsoft.com/office/drawing/2016/5/12/chartex" xmlns:cx7="http://schemas.microsoft.com/office/drawing/2016/5/13/chartex" xmlns:cx8="http://schemas.microsoft.com/office/drawing/2016/5/14/chartex" xmlns:mc="http://schemas.openxmlformats.org/markup-compatibility/2006" xmlns:aink="http://schemas.microsoft.com/office/drawing/2016/ink" xmlns:am3d="http://schemas.microsoft.com/office/drawing/2017/model3d" xmlns:o="urn:schemas-microsoft-com:office:office" xmlns:oel="http://schemas.microsoft.com/office/2019/extlst" xmlns:r="http://schemas.openxmlformats.org/officeDocument/2006/relationships" xmlns:m="http://schemas.openxmlformats.org/officeDocument/2006/math" xmlns:v="urn:schemas-microsoft-com:vml" xmlns:wp14="http://schemas.microsoft.com/office/word/2010/wordprocessingDrawing" xmlns:wp="http://schemas.openxmlformats.org/drawingml/2006/wordprocessingDrawing" xmlns:w10="urn:schemas-microsoft-com:office:word" xmlns:w="http://schemas.openxmlformats.org/wordprocessingml/2006/main" xmlns:w14="http://schemas.microsoft.com/office/word/2010/wordml" xmlns:w15="http://schemas.microsoft.com/office/word/2012/wordml" xmlns:w16cex="http://schemas.microsoft.com/office/word/2018/wordml/cex" xmlns:w16cid="http://schemas.microsoft.com/office/word/2016/wordml/cid" xmlns:w16="http://schemas.microsoft.com/office/word/2018/wordml" xmlns:w16sdtdh="http://schemas.microsoft.com/office/word/2020/wordml/sdtdatahash" xmlns:w16se="http://schemas.microsoft.com/office/word/2015/wordml/symex" xmlns:wpg="http://schemas.microsoft.com/office/word/2010/wordprocessingGroup" xmlns:wpi="http://schemas.microsoft.com/office/word/2010/wordprocessingInk" xmlns:wne="http://schemas.microsoft.com/office/word/2006/wordml" xmlns:wps="http://schemas.microsoft.com/office/word/2010/wordprocessingShape" mc:Ignorable="w14 w15 w16se w16cid w16 w16cex w16sdtdh wp14">
+  <w:footnote w:type="separator" w:id="-1">
+    <w:p>
+      <w:pPr>
+        <w:spacing w:after="0" w:line="240" w:lineRule="auto"/>
+      </w:pPr>
+      <w:r>
+        <w:separator/>
+      </w:r>
+    </w:p>
+  </w:footnote>
+  <w:footnote w:type="continuationSeparator" w:id="0">
+    <w:p>
+      <w:pPr>
+        <w:spacing w:after="0" w:line="240" w:lineRule="auto"/>
+      </w:pPr>
+      <w:r>
+        <w:continuationSeparator/>
+      </w:r>
+    </w:p>
+  </w:footnote>
+</w:footnotes>
 </file>
 
 <file path=word/styles.xml><?xml version="1.0" encoding="utf-8"?>
@@ -904,6 +1130,50 @@
       <w:szCs w:val="24"/>
     </w:rPr>
   </w:style>
+  <w:style w:type="paragraph" w:styleId="Kopfzeile">
+    <w:name w:val="header"/>
+    <w:basedOn w:val="Standard"/>
+    <w:link w:val="KopfzeileZchn"/>
+    <w:uiPriority w:val="99"/>
+    <w:unhideWhenUsed/>
+    <w:rsid w:val="00AC5EE2"/>
+    <w:pPr>
+      <w:tabs>
+        <w:tab w:val="center" w:pos="4536"/>
+        <w:tab w:val="right" w:pos="9072"/>
+      </w:tabs>
+      <w:spacing w:after="0" w:line="240" w:lineRule="auto"/>
+    </w:pPr>
+  </w:style>
+  <w:style w:type="character" w:customStyle="1" w:styleId="KopfzeileZchn">
+    <w:name w:val="Kopfzeile Zchn"/>
+    <w:basedOn w:val="Absatz-Standardschriftart"/>
+    <w:link w:val="Kopfzeile"/>
+    <w:uiPriority w:val="99"/>
+    <w:rsid w:val="00AC5EE2"/>
+  </w:style>
+  <w:style w:type="paragraph" w:styleId="Fuzeile">
+    <w:name w:val="footer"/>
+    <w:basedOn w:val="Standard"/>
+    <w:link w:val="FuzeileZchn"/>
+    <w:uiPriority w:val="99"/>
+    <w:unhideWhenUsed/>
+    <w:rsid w:val="00AC5EE2"/>
+    <w:pPr>
+      <w:tabs>
+        <w:tab w:val="center" w:pos="4536"/>
+        <w:tab w:val="right" w:pos="9072"/>
+      </w:tabs>
+      <w:spacing w:after="0" w:line="240" w:lineRule="auto"/>
+    </w:pPr>
+  </w:style>
+  <w:style w:type="character" w:customStyle="1" w:styleId="FuzeileZchn">
+    <w:name w:val="Fußzeile Zchn"/>
+    <w:basedOn w:val="Absatz-Standardschriftart"/>
+    <w:link w:val="Fuzeile"/>
+    <w:uiPriority w:val="99"/>
+    <w:rsid w:val="00AC5EE2"/>
+  </w:style>
 </w:styles>
 </file>
 

</xml_diff>